<commit_message>
feat(shengen): Sber template with new office and no stamps (Pack 73.12)
</commit_message>
<xml_diff>
--- a/templates/docx/bank_statement_template_044525225_v2-shengen.docx
+++ b/templates/docx/bank_statement_template_044525225_v2-shengen.docx
@@ -1537,7 +1537,7 @@
                 <w:color w:val="1A1A1A"/>
                 <w:sz w:val="16"/>
               </w:rPr>
-              <w:t xml:space="preserve">Доп.офис №9038/01655</w:t>
+              <w:t xml:space="preserve">Доп.офис №9038/01249</w:t>
             </w:r>
           </w:p>
         </w:tc>
@@ -1637,7 +1637,7 @@
                 <w:color w:val="1A1A1A"/>
                 <w:sz w:val="16"/>
               </w:rPr>
-              <w:t xml:space="preserve">№9038/01655</w:t>
+              <w:t xml:space="preserve">№9038/01249</w:t>
             </w:r>
           </w:p>
         </w:tc>
@@ -1716,7 +1716,7 @@
                 <w:color w:val="1A1A1A"/>
                 <w:sz w:val="16"/>
               </w:rPr>
-              <w:t xml:space="preserve">г Москва, ул Алтайская, д 4</w:t>
+              <w:t xml:space="preserve">г.Москва, просп. Вернадского, д. 86</w:t>
             </w:r>
           </w:p>
         </w:tc>

</xml_diff>